<commit_message>
feat: implement job detail page component with application logic and fallback data
</commit_message>
<xml_diff>
--- a/docs/architecture.docx
+++ b/docs/architecture.docx
@@ -195,7 +195,7 @@
         <w:br/>
         <w:t>|  - Hỗ trợ song song cả PostgreSQL 18 &amp; MySQL 8 (Mật khẩu: 12345)        |</w:t>
         <w:br/>
-        <w:t>|  - Tích hợp bộ dataset thực tế VietJobs (1.450+ việc làm chuẩn hóa)    |</w:t>
+        <w:t>|  - Tích hợp bộ dataset thực tế chuẩn hóa (1.470+ việc làm thực tế)     |</w:t>
         <w:br/>
         <w:t>|  - Đảm bảo toàn vẹn giao dịch ACID, ràng buộc khóa ngoại (FK)           |</w:t>
         <w:br/>
@@ -1234,7 +1234,7 @@
         <w:rPr>
           <w:b/>
         </w:rPr>
-        <w:t>Quy mô tập dữ liệu thực tế (VietJobs Dataset):</w:t>
+        <w:t>Quy mô tập dữ liệu thực tế (Dataset Scale):</w:t>
       </w:r>
     </w:p>
     <w:p>
@@ -1252,14 +1252,14 @@
         <w:rPr>
           <w:b/>
         </w:rPr>
-        <w:t>1.450+ việc làm bán thời gian, dự án freelance và thực tập sinh</w:t>
+        <w:t>1.470+ việc làm bán thời gian, dự án freelance và thực tập sinh</w:t>
       </w:r>
       <w:r>
         <w:rPr>
           <w:rFonts w:ascii="Segoe UI" w:hAnsi="Segoe UI"/>
           <w:sz w:val="21"/>
         </w:rPr>
-        <w:t xml:space="preserve"> đã qua chuẩn hóa và làm sạch.</w:t>
+        <w:t xml:space="preserve"> đã qua chuẩn hóa và làm sạch (VietJobs kết hợp dữ liệu cào mới từ Internet tại TP.HCM).</w:t>
       </w:r>
     </w:p>
     <w:p>

</xml_diff>